<commit_message>
Keep only the references cited in the write-up
Co-Authored-By: Claude Opus 5.5 <noreply@anthropic.com>
</commit_message>
<xml_diff>
--- a/writeup_he.docx
+++ b/writeup_he.docx
@@ -49,77 +49,7 @@
         <w:rPr>
           <w:rtl/>
         </w:rPr>
-        <w:t>סקרים. 34 סקרים של 9 חברות סקרים, שהעבודה עליהם הסתיימה בין 7 ל-23 באוקטובר, כפי שהוגשו לוועדת הבחירות המרכזית, כולל אחוזי התמיכה וגודל המדגם. החלון כולל את השבועיים וחצי האחרונים, כי רק סקרים מהשבועות האחרונים מנבאים את התוצאה (</w:t>
-      </w:r>
-      <w:proofErr w:type="spellStart"/>
-      <w:r>
-        <w:rPr>
-          <w:rtl/>
-        </w:rPr>
-        <w:t>van</w:t>
-      </w:r>
-      <w:proofErr w:type="spellEnd"/>
-      <w:r>
-        <w:rPr>
-          <w:rtl/>
-        </w:rPr>
-        <w:t xml:space="preserve"> </w:t>
-      </w:r>
-      <w:proofErr w:type="spellStart"/>
-      <w:r>
-        <w:rPr>
-          <w:rtl/>
-        </w:rPr>
-        <w:t>der</w:t>
-      </w:r>
-      <w:proofErr w:type="spellEnd"/>
-      <w:r>
-        <w:rPr>
-          <w:rtl/>
-        </w:rPr>
-        <w:t xml:space="preserve"> </w:t>
-      </w:r>
-      <w:proofErr w:type="spellStart"/>
-      <w:r>
-        <w:rPr>
-          <w:rtl/>
-        </w:rPr>
-        <w:t>Meer</w:t>
-      </w:r>
-      <w:proofErr w:type="spellEnd"/>
-      <w:r>
-        <w:rPr>
-          <w:rtl/>
-        </w:rPr>
-        <w:t xml:space="preserve"> </w:t>
-      </w:r>
-      <w:proofErr w:type="spellStart"/>
-      <w:r>
-        <w:rPr>
-          <w:rtl/>
-        </w:rPr>
-        <w:t>et</w:t>
-      </w:r>
-      <w:proofErr w:type="spellEnd"/>
-      <w:r>
-        <w:rPr>
-          <w:rtl/>
-        </w:rPr>
-        <w:t xml:space="preserve"> </w:t>
-      </w:r>
-      <w:proofErr w:type="spellStart"/>
-      <w:r>
-        <w:rPr>
-          <w:rtl/>
-        </w:rPr>
-        <w:t>al</w:t>
-      </w:r>
-      <w:proofErr w:type="spellEnd"/>
-      <w:r>
-        <w:rPr>
-          <w:rtl/>
-        </w:rPr>
-        <w:t>., 2023). בסקרי חדשות 13, שמפרסמים מנדטים בלבד, המנדטים הומרו לאחוזים.</w:t>
+        <w:t>סקרים. 34 סקרים של 9 חברות סקרים, שהעבודה עליהם הסתיימה בין 7 ל-23 באוקטובר, כפי שהוגשו לוועדת הבחירות המרכזית, כולל אחוזי התמיכה וגודל המדגם. החלון כולל את השבועיים וחצי האחרונים, כי רק סקרים מהשבועות האחרונים מנבאים את התוצאה (van der Meer et al., 2023). בסקרי חדשות 13, שמפרסמים מנדטים בלבד, המנדטים הומרו לאחוזים.</w:t>
       </w:r>
       <w:r>
         <w:rPr>
@@ -212,49 +142,7 @@
         <w:rPr>
           <w:rtl/>
         </w:rPr>
-        <w:t>4. אין לרשימה מסוימת הטיה קבועה בסקרים. בבחירות קודמות כיוון הטעות של כל רשימה השתנה מבחירות לבחירות (</w:t>
-      </w:r>
-      <w:proofErr w:type="spellStart"/>
-      <w:r>
-        <w:rPr>
-          <w:rtl/>
-        </w:rPr>
-        <w:t>Selb</w:t>
-      </w:r>
-      <w:proofErr w:type="spellEnd"/>
-      <w:r>
-        <w:rPr>
-          <w:rtl/>
-        </w:rPr>
-        <w:t xml:space="preserve"> </w:t>
-      </w:r>
-      <w:proofErr w:type="spellStart"/>
-      <w:r>
-        <w:rPr>
-          <w:rtl/>
-        </w:rPr>
-        <w:t>et</w:t>
-      </w:r>
-      <w:proofErr w:type="spellEnd"/>
-      <w:r>
-        <w:rPr>
-          <w:rtl/>
-        </w:rPr>
-        <w:t xml:space="preserve"> </w:t>
-      </w:r>
-      <w:proofErr w:type="spellStart"/>
-      <w:r>
-        <w:rPr>
-          <w:rtl/>
-        </w:rPr>
-        <w:t>al</w:t>
-      </w:r>
-      <w:proofErr w:type="spellEnd"/>
-      <w:r>
-        <w:rPr>
-          <w:rtl/>
-        </w:rPr>
-        <w:t>., 2023).</w:t>
+        <w:t>4. אין לרשימה מסוימת הטיה קבועה בסקרים. בבחירות קודמות כיוון הטעות של כל רשימה השתנה מבחירות לבחירות (Selb et al., 2023).</w:t>
       </w:r>
     </w:p>
     <w:p>
@@ -416,11 +304,9 @@
       <w:pPr>
         <w:spacing w:after="100" w:line="276" w:lineRule="auto"/>
         <w:ind w:left="360" w:hanging="360"/>
-        <w:jc w:val="left"/>
-      </w:pPr>
-      <w:r>
-        <w:rPr>
-          <w:rFonts w:ascii="Arial" w:hAnsi="Arial" w:cs="Arial"/>
+      </w:pPr>
+      <w:r>
+        <w:rPr>
           <w:sz w:val="20"/>
           <w:szCs w:val="20"/>
         </w:rPr>
@@ -428,116 +314,46 @@
       </w:r>
       <w:r>
         <w:rPr>
-          <w:rFonts w:ascii="Arial" w:hAnsi="Arial" w:cs="Arial"/>
           <w:i/>
           <w:sz w:val="20"/>
           <w:szCs w:val="20"/>
         </w:rPr>
-        <w:t xml:space="preserve">Public Opinion Quarterly</w:t>
-      </w:r>
-      <w:r>
-        <w:rPr>
-          <w:rFonts w:ascii="Arial" w:hAnsi="Arial" w:cs="Arial"/>
+        <w:t>Public Opinion Quarterly</w:t>
+      </w:r>
+      <w:r>
+        <w:rPr>
           <w:sz w:val="20"/>
           <w:szCs w:val="20"/>
         </w:rPr>
-        <w:t xml:space="preserve">, 87(4), 1025–1037.</w:t>
+        <w:t>, 87(4), 1025–1037.</w:t>
       </w:r>
     </w:p>
     <w:p>
       <w:pPr>
         <w:spacing w:after="100" w:line="276" w:lineRule="auto"/>
         <w:ind w:left="360" w:hanging="360"/>
-        <w:jc w:val="left"/>
-      </w:pPr>
-      <w:r>
-        <w:rPr>
-          <w:rFonts w:ascii="Arial" w:hAnsi="Arial" w:cs="Arial"/>
+      </w:pPr>
+      <w:r>
+        <w:rPr>
           <w:sz w:val="20"/>
           <w:szCs w:val="20"/>
         </w:rPr>
-        <w:t xml:space="preserve">Shirani-Mehr, H., Rothschild, D., Goel, S., &amp; Gelman, A. (2018). Disentangling bias and variance in election polls. </w:t>
-      </w:r>
-      <w:r>
-        <w:rPr>
-          <w:rFonts w:ascii="Arial" w:hAnsi="Arial" w:cs="Arial"/>
+        <w:t xml:space="preserve">van der Meer, T. W. G., Janssen, L., &amp; Louwerse, T. (2023). The predictive value of polls in a fragmented multi-party system: The Netherlands (1998–2021). </w:t>
+      </w:r>
+      <w:r>
+        <w:rPr>
           <w:i/>
           <w:sz w:val="20"/>
           <w:szCs w:val="20"/>
         </w:rPr>
-        <w:t xml:space="preserve">Journal of the American Statistical Association</w:t>
-      </w:r>
-      <w:r>
-        <w:rPr>
-          <w:rFonts w:ascii="Arial" w:hAnsi="Arial" w:cs="Arial"/>
+        <w:t>Acta Politica</w:t>
+      </w:r>
+      <w:r>
+        <w:rPr>
           <w:sz w:val="20"/>
           <w:szCs w:val="20"/>
         </w:rPr>
-        <w:t xml:space="preserve">, 113(522), 607–614.</w:t>
-      </w:r>
-    </w:p>
-    <w:p>
-      <w:pPr>
-        <w:spacing w:after="100" w:line="276" w:lineRule="auto"/>
-        <w:ind w:left="360" w:hanging="360"/>
-        <w:jc w:val="left"/>
-      </w:pPr>
-      <w:r>
-        <w:rPr>
-          <w:rFonts w:ascii="Arial" w:hAnsi="Arial" w:cs="Arial"/>
-          <w:sz w:val="20"/>
-          <w:szCs w:val="20"/>
-        </w:rPr>
-        <w:t xml:space="preserve">Stoetzer, L. F., Neunhoeffer, M., Gschwend, T., Munzert, S., &amp; Sternberg, S. (2019). Forecasting elections in multiparty systems: A Bayesian approach combining polls and fundamentals. </w:t>
-      </w:r>
-      <w:r>
-        <w:rPr>
-          <w:rFonts w:ascii="Arial" w:hAnsi="Arial" w:cs="Arial"/>
-          <w:i/>
-          <w:sz w:val="20"/>
-          <w:szCs w:val="20"/>
-        </w:rPr>
-        <w:t xml:space="preserve">Political Analysis</w:t>
-      </w:r>
-      <w:r>
-        <w:rPr>
-          <w:rFonts w:ascii="Arial" w:hAnsi="Arial" w:cs="Arial"/>
-          <w:sz w:val="20"/>
-          <w:szCs w:val="20"/>
-        </w:rPr>
-        <w:t xml:space="preserve">, 27, 255–262.</w:t>
-      </w:r>
-    </w:p>
-    <w:p>
-      <w:pPr>
-        <w:spacing w:after="100" w:line="276" w:lineRule="auto"/>
-        <w:ind w:left="360" w:hanging="360"/>
-        <w:jc w:val="left"/>
-      </w:pPr>
-      <w:r>
-        <w:rPr>
-          <w:rFonts w:ascii="Arial" w:hAnsi="Arial" w:cs="Arial"/>
-          <w:sz w:val="20"/>
-          <w:szCs w:val="20"/>
-        </w:rPr>
-        <w:t xml:space="preserve">van der Meer, T. W. G., Janssen, L., &amp; Louwerse, T. (2023). The predictive value of polls in a fragmented multi-party system: The Netherlands (1998–2021). </w:t>
-      </w:r>
-      <w:r>
-        <w:rPr>
-          <w:rFonts w:ascii="Arial" w:hAnsi="Arial" w:cs="Arial"/>
-          <w:i/>
-          <w:sz w:val="20"/>
-          <w:szCs w:val="20"/>
-        </w:rPr>
-        <w:t xml:space="preserve">Acta Politica</w:t>
-      </w:r>
-      <w:r>
-        <w:rPr>
-          <w:rFonts w:ascii="Arial" w:hAnsi="Arial" w:cs="Arial"/>
-          <w:sz w:val="20"/>
-          <w:szCs w:val="20"/>
-        </w:rPr>
-        <w:t xml:space="preserve">, 58, 461–482.</w:t>
+        <w:t>, 58, 461–482.</w:t>
       </w:r>
     </w:p>
     <w:sectPr>
@@ -1142,6 +958,7 @@
   <w:style w:type="character" w:default="1" w:styleId="DefaultParagraphFont">
     <w:name w:val="Default Paragraph Font"/>
     <w:uiPriority w:val="1"/>
+    <w:semiHidden/>
     <w:unhideWhenUsed/>
   </w:style>
   <w:style w:type="table" w:default="1" w:styleId="TableNormal">

</xml_diff>